<commit_message>
Clarita: reliquidación por terminación anticipada decidida (contrato base + carta de instrucciones)
Co-Authored-By: Claude Opus 5.5 <noreply@anthropic.com>
</commit_message>
<xml_diff>
--- a/finanzas/clarita/plantillas/base_contrato_coliving.docx
+++ b/finanzas/clarita/plantillas/base_contrato_coliving.docx
@@ -1245,9 +1245,37 @@
       </w:pPr>
       <w:r>
         <w:rPr>
-          <w:rtl w:val="0"/>
-        </w:rPr>
-        <w:t xml:space="preserve">[PENDIENTE DE DECISIÓN — reliquidación: si el canon tuvo descuento por plazo (6–11 o 12 meses) y el contrato termina antes, ¿se cobra la diferencia con el canon del escalón realmente cumplido? Definir antes de usar este contrato y borrar esta nota.]</w:t>
+          <w:b w:val="1"/>
+          <w:bCs w:val="1"/>
+          <w:rtl w:val="0"/>
+        </w:rPr>
+        <w:t xml:space="preserve">Reliquidación por terminación anticipada.</w:t>
+      </w:r>
+      <w:r>
+        <w:rPr>
+          <w:rtl w:val="0"/>
+        </w:rPr>
+        <w:t xml:space="preserve"> El canon de la cláusula tercera tiene un descuento que se concede porque EL ARRENDATARIO se compromete a cumplir el plazo pactado. Las tarifas vigentes al firmar son: 3 a 5 meses, $____________; 6 a 11 meses, $____________; 12 meses, $____________ (más el recargo por segundo ocupante, si aplica). Si el contrato termina antes del plazo por decisión o incumplimiento de EL ARRENDATARIO, se reliquidan los meses ya causados con la tarifa del escalón realmente cumplido, y EL ARRENDATARIO paga la diferencia junto con el último canon. Si se retira antes de cumplir 3 meses, se aplica la tarifa de 3 a 5 meses. Esta suma queda garantizada con el pagaré de la cláusula quinta.</w:t>
+      </w:r>
+    </w:p>
+    <w:p>
+      <w:pPr>
+        <w:spacing w:after="240" w:lineRule="auto"/>
+        <w:rPr/>
+      </w:pPr>
+      <w:r>
+        <w:rPr>
+          <w:b w:val="1"/>
+          <w:bCs w:val="1"/>
+          <w:rtl w:val="0"/>
+        </w:rPr>
+        <w:t xml:space="preserve">Ejemplo:</w:t>
+      </w:r>
+      <w:r>
+        <w:rPr>
+          <w:rtl w:val="0"/>
+        </w:rPr>
+        <w:t xml:space="preserve"> contrato de 12 meses a $1.400.000 que termina en el mes 8. El escalón cumplido es el de 6 a 11 meses ($1.450.000): se pagan $50.000 × 8 meses = $400.000.</w:t>
       </w:r>
     </w:p>
     <w:p>

</xml_diff>